<commit_message>
docs(ufo): hover cap, hopper rule and dependant pops in the UFO Magnet spec
Three contradictions the analysis raised, settled under autopilot:

- §2: hover = centre + 40, at most ceiling − 15, so the arrival at +10 stays
  under the ceiling and a Cannon charge (spawned at most ceiling − 1)
  always starts above the hull (L0-sauc-cx01).
- §5: a hopper with any contents is a container — its iron stacks are
  taken and it stays; an empty hopper is pulled as a block (L0-lgnd-cx13).
- §5: blocks resting on a removed iron block pop by vanilla rules; "exactly
  one item" is the pulled block's own (L0-magn-cxdp). AC-2 and AC-10 follow.

Type: records-decision
Decision: L0-sauc-cx01 hover cap ceiling − 15
Decision: L0-lgnd-cx13 a hopper with contents is a container
Decision: L0-magn-cxdp vanilla pops of dependants are allowed

Co-Authored-By: Claude Opus 5.5 <noreply@anthropic.com>
</commit_message>
<xml_diff>
--- a/docs/UFO_Magnet_Spec_v1_RU_EN.docx
+++ b/docs/UFO_Magnet_Spec_v1_RU_EN.docx
@@ -316,7 +316,7 @@
         <w:pStyle w:val="ListBullet"/>
       </w:pPr>
       <w:r>
-        <w:t>Высота зависания: центр + 40 блоков, но не выше потолка измерения минус 4.</w:t>
+        <w:t>Высота зависания: центр + 40 блоков, но не выше потолка измерения минус 15. Так подлёт и улёт на +10 остаются ниже потолка, а заряд Орбитальной пушки (появляется не выше потолка − 1) всегда стартует выше корпуса и может его пересечь.</w:t>
       </w:r>
     </w:p>
     <w:p>
@@ -518,6 +518,14 @@
       </w:r>
     </w:p>
     <w:p>
+      <w:pPr>
+        <w:pStyle w:val="ListBullet"/>
+      </w:pPr>
+      <w:r>
+        <w:t>Воронка, в которой есть хоть что-то, считается контейнером: из неё вынимаются железные стопки, сама воронка остаётся на месте. Пустая воронка притягивается как железный блок.</w:t>
+      </w:r>
+    </w:p>
+    <w:p>
       <w:r>
         <w:t>Блоки / Blocks</w:t>
       </w:r>
@@ -527,7 +535,15 @@
         <w:pStyle w:val="ListBullet"/>
       </w:pPr>
       <w:r>
-        <w:t>Выбранный блок заменяется воздухом, а на его месте появляется его предмет, который и летит. Дверь снимается целиком (обе половины) и даёт один предмет; лишнего дропа нет (U6).</w:t>
+        <w:t>Выбранный блок заменяется воздухом, а на его месте появляется его предмет, который и летит. Дверь снимается целиком (обе половины) и даёт один предмет; сам блок не даёт лишнего дропа (U6).</w:t>
+      </w:r>
+    </w:p>
+    <w:p>
+      <w:pPr>
+        <w:pStyle w:val="ListBullet"/>
+      </w:pPr>
+      <w:r>
+        <w:t>Блоки, которые держались на снятом железном блоке (факел, рельс, кнопка и т. п.), выпадают по ванильным правилам — это не потеря и не дюп. «Ровно один предмет» относится к самому притянутому блоку.</w:t>
       </w:r>
     </w:p>
     <w:p>
@@ -963,7 +979,7 @@
         <w:pStyle w:val="ListNumber"/>
       </w:pPr>
       <w:r>
-        <w:t>The saucer appears 90 blocks out, reaches the hover point (centre + 40) in 20 s, the magnet lasts 60 s, departure 15 s, then the saucer is gone.</w:t>
+        <w:t>The saucer appears 90 blocks out, reaches the hover point (centre + 40, at most ceiling − 15) in 20 s, the magnet lasts 60 s, departure 15 s, then the saucer is gone.</w:t>
       </w:r>
     </w:p>
     <w:p>
@@ -1027,7 +1043,7 @@
         <w:pStyle w:val="ListNumber"/>
       </w:pPr>
       <w:r>
-        <w:t>A pulled block becomes air and exactly one item; a door goes as a whole; ore yields one raw iron; nothing else drops.</w:t>
+        <w:t>A pulled block becomes air and exactly one item of its own; a door goes as a whole; ore yields one raw iron; blocks resting on it pop by vanilla rules; a hopper with contents keeps its place and only its iron stacks are taken.</w:t>
       </w:r>
     </w:p>
     <w:p>

</xml_diff>